<commit_message>
Rolls acceptance report: add heating check results
Co-Authored-By: Claude Opus 5.5 <noreply@anthropic.com>
Claude-Session: https://claude.ai/code/session_01DhfrxujFdtSZWrLQm5rNqB
</commit_message>
<xml_diff>
--- a/Акт_приемочных_испытаний_валов_RU-EN-CN.docx
+++ b/Акт_приемочных_испытаний_валов_RU-EN-CN.docx
@@ -11252,16 +11252,29 @@
                 <w:sz w:val="17"/>
                 <w:szCs w:val="17"/>
               </w:rPr>
-              <w:t xml:space="preserve"> — </w:t>
-            </w:r>
-            <w:r>
-              <w:rPr>
-                <w:rFonts w:ascii="Calibri" w:cs="Calibri" w:eastAsia="Microsoft YaHei" w:hAnsi="Calibri"/>
-                <w:color w:val="000000"/>
-                <w:sz w:val="17"/>
-                <w:szCs w:val="17"/>
-              </w:rPr>
-              <w:t xml:space="preserve">[заполнить · to be filled · 待填写]</w:t>
+              <w:t xml:space="preserve"> — нагрев, точность поддержания температуры ±2 °C на ширине вала 1250 мм: </w:t>
+            </w:r>
+            <w:r>
+              <w:rPr>
+                <w:rFonts w:ascii="Calibri" w:cs="Calibri" w:eastAsia="Microsoft YaHei" w:hAnsi="Calibri"/>
+                <w:b/>
+                <w:bCs/>
+                <w:i/>
+                <w:iCs/>
+                <w:color w:val="000000"/>
+                <w:sz w:val="17"/>
+                <w:szCs w:val="17"/>
+              </w:rPr>
+              <w:t xml:space="preserve">пройдено условно</w:t>
+            </w:r>
+            <w:r>
+              <w:rPr>
+                <w:rFonts w:ascii="Calibri" w:cs="Calibri" w:eastAsia="Microsoft YaHei" w:hAnsi="Calibri"/>
+                <w:color w:val="000000"/>
+                <w:sz w:val="17"/>
+                <w:szCs w:val="17"/>
+              </w:rPr>
+              <w:t xml:space="preserve">. Точность достигнута на рабочей ширине 1200 мм.</w:t>
             </w:r>
           </w:p>
         </w:tc>
@@ -11324,16 +11337,29 @@
                 <w:sz w:val="17"/>
                 <w:szCs w:val="17"/>
               </w:rPr>
-              <w:t xml:space="preserve"> — </w:t>
-            </w:r>
-            <w:r>
-              <w:rPr>
-                <w:rFonts w:ascii="Calibri" w:cs="Calibri" w:eastAsia="Microsoft YaHei" w:hAnsi="Calibri"/>
-                <w:color w:val="000000"/>
-                <w:sz w:val="17"/>
-                <w:szCs w:val="17"/>
-              </w:rPr>
-              <w:t xml:space="preserve">[заполнить · to be filled · 待填写]</w:t>
+              <w:t xml:space="preserve"> — heating, temperature control accuracy of ±2 °C across a roll width of 1250 mm: </w:t>
+            </w:r>
+            <w:r>
+              <w:rPr>
+                <w:rFonts w:ascii="Calibri" w:cs="Calibri" w:eastAsia="Microsoft YaHei" w:hAnsi="Calibri"/>
+                <w:b/>
+                <w:bCs/>
+                <w:i/>
+                <w:iCs/>
+                <w:color w:val="000000"/>
+                <w:sz w:val="17"/>
+                <w:szCs w:val="17"/>
+              </w:rPr>
+              <w:t xml:space="preserve">conditionally passed</w:t>
+            </w:r>
+            <w:r>
+              <w:rPr>
+                <w:rFonts w:ascii="Calibri" w:cs="Calibri" w:eastAsia="Microsoft YaHei" w:hAnsi="Calibri"/>
+                <w:color w:val="000000"/>
+                <w:sz w:val="17"/>
+                <w:szCs w:val="17"/>
+              </w:rPr>
+              <w:t xml:space="preserve">. The accuracy was achieved over a working width of 1200 mm.</w:t>
             </w:r>
           </w:p>
         </w:tc>
@@ -11396,16 +11422,29 @@
                 <w:sz w:val="17"/>
                 <w:szCs w:val="17"/>
               </w:rPr>
-              <w:t xml:space="preserve">——</w:t>
-            </w:r>
-            <w:r>
-              <w:rPr>
-                <w:rFonts w:ascii="Calibri" w:cs="Calibri" w:eastAsia="Microsoft YaHei" w:hAnsi="Calibri"/>
-                <w:color w:val="000000"/>
-                <w:sz w:val="17"/>
-                <w:szCs w:val="17"/>
-              </w:rPr>
-              <w:t xml:space="preserve">[заполнить · to be filled · 待填写]</w:t>
+              <w:t xml:space="preserve">——加热，在 1250 mm 辊宽范围内温度控制精度 ±2 °C：</w:t>
+            </w:r>
+            <w:r>
+              <w:rPr>
+                <w:rFonts w:ascii="Calibri" w:cs="Calibri" w:eastAsia="Microsoft YaHei" w:hAnsi="Calibri"/>
+                <w:b/>
+                <w:bCs/>
+                <w:i/>
+                <w:iCs/>
+                <w:color w:val="000000"/>
+                <w:sz w:val="17"/>
+                <w:szCs w:val="17"/>
+              </w:rPr>
+              <w:t xml:space="preserve">有条件通过</w:t>
+            </w:r>
+            <w:r>
+              <w:rPr>
+                <w:rFonts w:ascii="Calibri" w:cs="Calibri" w:eastAsia="Microsoft YaHei" w:hAnsi="Calibri"/>
+                <w:color w:val="000000"/>
+                <w:sz w:val="17"/>
+                <w:szCs w:val="17"/>
+              </w:rPr>
+              <w:t xml:space="preserve">。该精度在 1200 mm 工作宽度内达到。</w:t>
             </w:r>
           </w:p>
         </w:tc>
@@ -11473,16 +11512,29 @@
                 <w:sz w:val="17"/>
                 <w:szCs w:val="17"/>
               </w:rPr>
-              <w:t xml:space="preserve"> — </w:t>
-            </w:r>
-            <w:r>
-              <w:rPr>
-                <w:rFonts w:ascii="Calibri" w:cs="Calibri" w:eastAsia="Microsoft YaHei" w:hAnsi="Calibri"/>
-                <w:color w:val="000000"/>
-                <w:sz w:val="17"/>
-                <w:szCs w:val="17"/>
-              </w:rPr>
-              <w:t xml:space="preserve">[заполнить · to be filled · 待填写]</w:t>
+              <w:t xml:space="preserve"> — нагрев, точность поддержания температуры ±2 °C на ширине вала 1250 мм: </w:t>
+            </w:r>
+            <w:r>
+              <w:rPr>
+                <w:rFonts w:ascii="Calibri" w:cs="Calibri" w:eastAsia="Microsoft YaHei" w:hAnsi="Calibri"/>
+                <w:b/>
+                <w:bCs/>
+                <w:i/>
+                <w:iCs/>
+                <w:color w:val="000000"/>
+                <w:sz w:val="17"/>
+                <w:szCs w:val="17"/>
+              </w:rPr>
+              <w:t xml:space="preserve">пройдено условно</w:t>
+            </w:r>
+            <w:r>
+              <w:rPr>
+                <w:rFonts w:ascii="Calibri" w:cs="Calibri" w:eastAsia="Microsoft YaHei" w:hAnsi="Calibri"/>
+                <w:color w:val="000000"/>
+                <w:sz w:val="17"/>
+                <w:szCs w:val="17"/>
+              </w:rPr>
+              <w:t xml:space="preserve">. Точность достигнута на рабочей ширине 1200 мм.</w:t>
             </w:r>
           </w:p>
         </w:tc>
@@ -11545,16 +11597,29 @@
                 <w:sz w:val="17"/>
                 <w:szCs w:val="17"/>
               </w:rPr>
-              <w:t xml:space="preserve"> — </w:t>
-            </w:r>
-            <w:r>
-              <w:rPr>
-                <w:rFonts w:ascii="Calibri" w:cs="Calibri" w:eastAsia="Microsoft YaHei" w:hAnsi="Calibri"/>
-                <w:color w:val="000000"/>
-                <w:sz w:val="17"/>
-                <w:szCs w:val="17"/>
-              </w:rPr>
-              <w:t xml:space="preserve">[заполнить · to be filled · 待填写]</w:t>
+              <w:t xml:space="preserve"> — heating, temperature control accuracy of ±2 °C across a roll width of 1250 mm: </w:t>
+            </w:r>
+            <w:r>
+              <w:rPr>
+                <w:rFonts w:ascii="Calibri" w:cs="Calibri" w:eastAsia="Microsoft YaHei" w:hAnsi="Calibri"/>
+                <w:b/>
+                <w:bCs/>
+                <w:i/>
+                <w:iCs/>
+                <w:color w:val="000000"/>
+                <w:sz w:val="17"/>
+                <w:szCs w:val="17"/>
+              </w:rPr>
+              <w:t xml:space="preserve">conditionally passed</w:t>
+            </w:r>
+            <w:r>
+              <w:rPr>
+                <w:rFonts w:ascii="Calibri" w:cs="Calibri" w:eastAsia="Microsoft YaHei" w:hAnsi="Calibri"/>
+                <w:color w:val="000000"/>
+                <w:sz w:val="17"/>
+                <w:szCs w:val="17"/>
+              </w:rPr>
+              <w:t xml:space="preserve">. The accuracy was achieved over a working width of 1200 mm.</w:t>
             </w:r>
           </w:p>
         </w:tc>
@@ -11617,16 +11682,29 @@
                 <w:sz w:val="17"/>
                 <w:szCs w:val="17"/>
               </w:rPr>
-              <w:t xml:space="preserve">——</w:t>
-            </w:r>
-            <w:r>
-              <w:rPr>
-                <w:rFonts w:ascii="Calibri" w:cs="Calibri" w:eastAsia="Microsoft YaHei" w:hAnsi="Calibri"/>
-                <w:color w:val="000000"/>
-                <w:sz w:val="17"/>
-                <w:szCs w:val="17"/>
-              </w:rPr>
-              <w:t xml:space="preserve">[заполнить · to be filled · 待填写]</w:t>
+              <w:t xml:space="preserve">——加热，在 1250 mm 辊宽范围内温度控制精度 ±2 °C：</w:t>
+            </w:r>
+            <w:r>
+              <w:rPr>
+                <w:rFonts w:ascii="Calibri" w:cs="Calibri" w:eastAsia="Microsoft YaHei" w:hAnsi="Calibri"/>
+                <w:b/>
+                <w:bCs/>
+                <w:i/>
+                <w:iCs/>
+                <w:color w:val="000000"/>
+                <w:sz w:val="17"/>
+                <w:szCs w:val="17"/>
+              </w:rPr>
+              <w:t xml:space="preserve">有条件通过</w:t>
+            </w:r>
+            <w:r>
+              <w:rPr>
+                <w:rFonts w:ascii="Calibri" w:cs="Calibri" w:eastAsia="Microsoft YaHei" w:hAnsi="Calibri"/>
+                <w:color w:val="000000"/>
+                <w:sz w:val="17"/>
+                <w:szCs w:val="17"/>
+              </w:rPr>
+              <w:t xml:space="preserve">。该精度在 1200 mm 工作宽度内达到。</w:t>
             </w:r>
           </w:p>
         </w:tc>

</xml_diff>

<commit_message>
Rolls acceptance report: add repeat heating check item
Co-Authored-By: Claude Opus 5.5 <noreply@anthropic.com>
Claude-Session: https://claude.ai/code/session_01DhfrxujFdtSZWrLQm5rNqB
</commit_message>
<xml_diff>
--- a/Акт_приемочных_испытаний_валов_RU-EN-CN.docx
+++ b/Акт_приемочных_испытаний_валов_RU-EN-CN.docx
@@ -11705,6 +11705,140 @@
                 <w:szCs w:val="17"/>
               </w:rPr>
               <w:t xml:space="preserve">。该精度在 1200 mm 工作宽度内达到。</w:t>
+            </w:r>
+          </w:p>
+        </w:tc>
+      </w:tr>
+      <w:tr>
+        <w:trPr>
+          <w:cantSplit/>
+        </w:trPr>
+        <w:tc>
+          <w:tcPr>
+            <w:tcW w:type="dxa" w:w="5084"/>
+            <w:tcBorders>
+              <w:top w:val="none" w:color="FFFFFF" w:sz="0"/>
+              <w:left w:val="none" w:color="FFFFFF" w:sz="0"/>
+              <w:bottom w:val="single" w:color="BFBFBF" w:sz="2"/>
+              <w:right w:val="single" w:color="BFBFBF" w:sz="2"/>
+            </w:tcBorders>
+            <w:tcMar>
+              <w:top w:type="dxa" w:w="70"/>
+              <w:left w:type="dxa" w:w="120"/>
+              <w:bottom w:type="dxa" w:w="70"/>
+              <w:right w:type="dxa" w:w="120"/>
+            </w:tcMar>
+            <w:vAlign w:val="top"/>
+          </w:tcPr>
+          <w:p>
+            <w:pPr>
+              <w:spacing w:after="0"/>
+            </w:pPr>
+            <w:r>
+              <w:rPr>
+                <w:rFonts w:ascii="Calibri" w:cs="Calibri" w:eastAsia="Microsoft YaHei" w:hAnsi="Calibri"/>
+                <w:b/>
+                <w:bCs/>
+                <w:color w:val="000000"/>
+                <w:sz w:val="17"/>
+                <w:szCs w:val="17"/>
+              </w:rPr>
+              <w:t xml:space="preserve">4.3  </w:t>
+            </w:r>
+            <w:r>
+              <w:rPr>
+                <w:rFonts w:ascii="Calibri" w:cs="Calibri" w:eastAsia="Microsoft YaHei" w:hAnsi="Calibri"/>
+                <w:color w:val="000000"/>
+                <w:sz w:val="17"/>
+                <w:szCs w:val="17"/>
+              </w:rPr>
+              <w:t xml:space="preserve">После установки коллекторного узла требуется повторная проверка нагрева (с видео- и фотофиксацией).</w:t>
+            </w:r>
+          </w:p>
+        </w:tc>
+        <w:tc>
+          <w:tcPr>
+            <w:tcW w:type="dxa" w:w="5084"/>
+            <w:tcBorders>
+              <w:top w:val="none" w:color="FFFFFF" w:sz="0"/>
+              <w:left w:val="none" w:color="FFFFFF" w:sz="0"/>
+              <w:bottom w:val="single" w:color="BFBFBF" w:sz="2"/>
+              <w:right w:val="single" w:color="BFBFBF" w:sz="2"/>
+            </w:tcBorders>
+            <w:tcMar>
+              <w:top w:type="dxa" w:w="70"/>
+              <w:left w:type="dxa" w:w="120"/>
+              <w:bottom w:type="dxa" w:w="70"/>
+              <w:right w:type="dxa" w:w="120"/>
+            </w:tcMar>
+            <w:vAlign w:val="top"/>
+          </w:tcPr>
+          <w:p>
+            <w:pPr>
+              <w:spacing w:after="0"/>
+            </w:pPr>
+            <w:r>
+              <w:rPr>
+                <w:rFonts w:ascii="Calibri" w:cs="Calibri" w:eastAsia="Microsoft YaHei" w:hAnsi="Calibri"/>
+                <w:b/>
+                <w:bCs/>
+                <w:color w:val="000000"/>
+                <w:sz w:val="17"/>
+                <w:szCs w:val="17"/>
+              </w:rPr>
+              <w:t xml:space="preserve">4.3  </w:t>
+            </w:r>
+            <w:r>
+              <w:rPr>
+                <w:rFonts w:ascii="Calibri" w:cs="Calibri" w:eastAsia="Microsoft YaHei" w:hAnsi="Calibri"/>
+                <w:color w:val="000000"/>
+                <w:sz w:val="17"/>
+                <w:szCs w:val="17"/>
+              </w:rPr>
+              <w:t xml:space="preserve">After the collector assembly has been installed, the heating check shall be repeated (with video and photo recording).</w:t>
+            </w:r>
+          </w:p>
+        </w:tc>
+        <w:tc>
+          <w:tcPr>
+            <w:tcW w:type="dxa" w:w="5084"/>
+            <w:tcBorders>
+              <w:top w:val="none" w:color="FFFFFF" w:sz="0"/>
+              <w:left w:val="none" w:color="FFFFFF" w:sz="0"/>
+              <w:bottom w:val="single" w:color="BFBFBF" w:sz="2"/>
+              <w:right w:val="none" w:color="FFFFFF" w:sz="0"/>
+            </w:tcBorders>
+            <w:tcMar>
+              <w:top w:type="dxa" w:w="70"/>
+              <w:left w:type="dxa" w:w="120"/>
+              <w:bottom w:type="dxa" w:w="70"/>
+              <w:right w:type="dxa" w:w="120"/>
+            </w:tcMar>
+            <w:vAlign w:val="top"/>
+          </w:tcPr>
+          <w:p>
+            <w:pPr>
+              <w:spacing w:after="0"/>
+            </w:pPr>
+            <w:r>
+              <w:rPr>
+                <w:rFonts w:ascii="Calibri" w:cs="Calibri" w:eastAsia="Microsoft YaHei" w:hAnsi="Calibri"/>
+                <w:b/>
+                <w:bCs/>
+                <w:color w:val="000000"/>
+                <w:sz w:val="17"/>
+                <w:szCs w:val="17"/>
+              </w:rPr>
+              <w:t xml:space="preserve">4.3  </w:t>
+            </w:r>
+            <w:r>
+              <w:rPr>
+                <w:rFonts w:ascii="Calibri" w:cs="Calibri" w:eastAsia="Microsoft YaHei" w:hAnsi="Calibri"/>
+                <w:color w:val="000000"/>
+                <w:sz w:val="17"/>
+                <w:szCs w:val="17"/>
+              </w:rPr>
+              <w:t xml:space="preserve">安装集电环组件后，须重新进行加热检查（并进行视频和照片记录）。</w:t>
             </w:r>
           </w:p>
         </w:tc>

</xml_diff>